<commit_message>
Completed Week 8 tasks
</commit_message>
<xml_diff>
--- a/Week_8_LabActivities/Week_8_Lab_Report.docx
+++ b/Week_8_LabActivities/Week_8_Lab_Report.docx
@@ -28,7 +28,7 @@
                     <pic:cNvPicPr/>
                   </pic:nvPicPr>
                   <pic:blipFill>
-                    <a:blip r:embed="rId4"/>
+                    <a:blip r:embed="rId5"/>
                     <a:stretch>
                       <a:fillRect/>
                     </a:stretch>
@@ -79,7 +79,7 @@
                     <pic:cNvPicPr/>
                   </pic:nvPicPr>
                   <pic:blipFill>
-                    <a:blip r:embed="rId5"/>
+                    <a:blip r:embed="rId6"/>
                     <a:stretch>
                       <a:fillRect/>
                     </a:stretch>
@@ -105,12 +105,174 @@
     </w:p>
     <w:p>
       <w:r>
-        <w:rPr>
-          <w:highlight w:val="yellow"/>
-        </w:rPr>
-        <w:t>Discuss BFS properties (level-by-level exploration).</w:t>
+        <w:t>Th</w:t>
+      </w:r>
+      <w:r>
+        <w:t xml:space="preserve">e table below shows the order the elements where added in </w:t>
       </w:r>
     </w:p>
+    <w:tbl>
+      <w:tblPr>
+        <w:tblStyle w:val="TableGrid"/>
+        <w:tblW w:w="0" w:type="auto"/>
+        <w:tblLook w:val="04A0" w:firstRow="1" w:lastRow="0" w:firstColumn="1" w:lastColumn="0" w:noHBand="0" w:noVBand="1"/>
+      </w:tblPr>
+      <w:tblGrid>
+        <w:gridCol w:w="3005"/>
+        <w:gridCol w:w="3005"/>
+      </w:tblGrid>
+      <w:tr>
+        <w:tc>
+          <w:tcPr>
+            <w:tcW w:w="3005" w:type="dxa"/>
+          </w:tcPr>
+          <w:p>
+            <w:r>
+              <w:t>Step 1</w:t>
+            </w:r>
+          </w:p>
+        </w:tc>
+        <w:tc>
+          <w:tcPr>
+            <w:tcW w:w="3005" w:type="dxa"/>
+          </w:tcPr>
+          <w:p>
+            <w:r>
+              <w:t>Add in B</w:t>
+            </w:r>
+          </w:p>
+        </w:tc>
+      </w:tr>
+      <w:tr>
+        <w:tc>
+          <w:tcPr>
+            <w:tcW w:w="3005" w:type="dxa"/>
+          </w:tcPr>
+          <w:p>
+            <w:r>
+              <w:t xml:space="preserve">Step </w:t>
+            </w:r>
+            <w:r>
+              <w:t>2</w:t>
+            </w:r>
+          </w:p>
+        </w:tc>
+        <w:tc>
+          <w:tcPr>
+            <w:tcW w:w="3005" w:type="dxa"/>
+          </w:tcPr>
+          <w:p>
+            <w:r>
+              <w:t>Add in A</w:t>
+            </w:r>
+          </w:p>
+        </w:tc>
+      </w:tr>
+      <w:tr>
+        <w:tc>
+          <w:tcPr>
+            <w:tcW w:w="3005" w:type="dxa"/>
+          </w:tcPr>
+          <w:p>
+            <w:r>
+              <w:t xml:space="preserve">Step </w:t>
+            </w:r>
+            <w:r>
+              <w:t>3</w:t>
+            </w:r>
+          </w:p>
+        </w:tc>
+        <w:tc>
+          <w:tcPr>
+            <w:tcW w:w="3005" w:type="dxa"/>
+          </w:tcPr>
+          <w:p>
+            <w:r>
+              <w:t>Add in C</w:t>
+            </w:r>
+          </w:p>
+        </w:tc>
+      </w:tr>
+      <w:tr>
+        <w:tc>
+          <w:tcPr>
+            <w:tcW w:w="3005" w:type="dxa"/>
+          </w:tcPr>
+          <w:p>
+            <w:r>
+              <w:t xml:space="preserve">Step </w:t>
+            </w:r>
+            <w:r>
+              <w:t>4</w:t>
+            </w:r>
+          </w:p>
+        </w:tc>
+        <w:tc>
+          <w:tcPr>
+            <w:tcW w:w="3005" w:type="dxa"/>
+          </w:tcPr>
+          <w:p>
+            <w:r>
+              <w:t xml:space="preserve">Take out </w:t>
+            </w:r>
+            <w:r>
+              <w:t>B</w:t>
+            </w:r>
+          </w:p>
+        </w:tc>
+      </w:tr>
+      <w:tr>
+        <w:tc>
+          <w:tcPr>
+            <w:tcW w:w="3005" w:type="dxa"/>
+          </w:tcPr>
+          <w:p>
+            <w:r>
+              <w:t xml:space="preserve">Step </w:t>
+            </w:r>
+            <w:r>
+              <w:t>5</w:t>
+            </w:r>
+          </w:p>
+        </w:tc>
+        <w:tc>
+          <w:tcPr>
+            <w:tcW w:w="3005" w:type="dxa"/>
+          </w:tcPr>
+          <w:p>
+            <w:r>
+              <w:t>Take out A</w:t>
+            </w:r>
+          </w:p>
+        </w:tc>
+      </w:tr>
+      <w:tr>
+        <w:tc>
+          <w:tcPr>
+            <w:tcW w:w="3005" w:type="dxa"/>
+          </w:tcPr>
+          <w:p>
+            <w:r>
+              <w:t xml:space="preserve">Step </w:t>
+            </w:r>
+            <w:r>
+              <w:t>6</w:t>
+            </w:r>
+          </w:p>
+        </w:tc>
+        <w:tc>
+          <w:tcPr>
+            <w:tcW w:w="3005" w:type="dxa"/>
+          </w:tcPr>
+          <w:p>
+            <w:r>
+              <w:t>Take out C</w:t>
+            </w:r>
+          </w:p>
+        </w:tc>
+      </w:tr>
+    </w:tbl>
+    <w:p/>
     <w:p>
       <w:r>
         <w:drawing>
@@ -137,7 +299,7 @@
                     <pic:cNvPicPr/>
                   </pic:nvPicPr>
                   <pic:blipFill>
-                    <a:blip r:embed="rId6"/>
+                    <a:blip r:embed="rId7"/>
                     <a:stretch>
                       <a:fillRect/>
                     </a:stretch>
@@ -161,24 +323,171 @@
         <w:t>Task 3</w:t>
       </w:r>
     </w:p>
+    <w:tbl>
+      <w:tblPr>
+        <w:tblStyle w:val="TableGrid"/>
+        <w:tblW w:w="0" w:type="auto"/>
+        <w:tblLook w:val="04A0" w:firstRow="1" w:lastRow="0" w:firstColumn="1" w:lastColumn="0" w:noHBand="0" w:noVBand="1"/>
+      </w:tblPr>
+      <w:tblGrid>
+        <w:gridCol w:w="3005"/>
+        <w:gridCol w:w="3005"/>
+      </w:tblGrid>
+      <w:tr>
+        <w:tc>
+          <w:tcPr>
+            <w:tcW w:w="3005" w:type="dxa"/>
+          </w:tcPr>
+          <w:p>
+            <w:r>
+              <w:t>Step 1</w:t>
+            </w:r>
+          </w:p>
+        </w:tc>
+        <w:tc>
+          <w:tcPr>
+            <w:tcW w:w="3005" w:type="dxa"/>
+          </w:tcPr>
+          <w:p>
+            <w:r>
+              <w:t xml:space="preserve">Add in </w:t>
+            </w:r>
+            <w:r>
+              <w:t>C</w:t>
+            </w:r>
+          </w:p>
+        </w:tc>
+      </w:tr>
+      <w:tr>
+        <w:tc>
+          <w:tcPr>
+            <w:tcW w:w="3005" w:type="dxa"/>
+          </w:tcPr>
+          <w:p>
+            <w:r>
+              <w:t>Step 2</w:t>
+            </w:r>
+          </w:p>
+        </w:tc>
+        <w:tc>
+          <w:tcPr>
+            <w:tcW w:w="3005" w:type="dxa"/>
+          </w:tcPr>
+          <w:p>
+            <w:r>
+              <w:t>Add in A</w:t>
+            </w:r>
+          </w:p>
+        </w:tc>
+      </w:tr>
+      <w:tr>
+        <w:tc>
+          <w:tcPr>
+            <w:tcW w:w="3005" w:type="dxa"/>
+          </w:tcPr>
+          <w:p>
+            <w:r>
+              <w:t>Step 3</w:t>
+            </w:r>
+          </w:p>
+        </w:tc>
+        <w:tc>
+          <w:tcPr>
+            <w:tcW w:w="3005" w:type="dxa"/>
+          </w:tcPr>
+          <w:p>
+            <w:r>
+              <w:t xml:space="preserve">Add in </w:t>
+            </w:r>
+            <w:r>
+              <w:t>B</w:t>
+            </w:r>
+          </w:p>
+        </w:tc>
+      </w:tr>
+      <w:tr>
+        <w:tc>
+          <w:tcPr>
+            <w:tcW w:w="3005" w:type="dxa"/>
+          </w:tcPr>
+          <w:p>
+            <w:r>
+              <w:t>Step 4</w:t>
+            </w:r>
+          </w:p>
+        </w:tc>
+        <w:tc>
+          <w:tcPr>
+            <w:tcW w:w="3005" w:type="dxa"/>
+          </w:tcPr>
+          <w:p>
+            <w:r>
+              <w:t>Take out B</w:t>
+            </w:r>
+          </w:p>
+        </w:tc>
+      </w:tr>
+      <w:tr>
+        <w:tc>
+          <w:tcPr>
+            <w:tcW w:w="3005" w:type="dxa"/>
+          </w:tcPr>
+          <w:p>
+            <w:r>
+              <w:t>Step 5</w:t>
+            </w:r>
+          </w:p>
+        </w:tc>
+        <w:tc>
+          <w:tcPr>
+            <w:tcW w:w="3005" w:type="dxa"/>
+          </w:tcPr>
+          <w:p>
+            <w:r>
+              <w:t>Take out A</w:t>
+            </w:r>
+          </w:p>
+        </w:tc>
+      </w:tr>
+      <w:tr>
+        <w:tc>
+          <w:tcPr>
+            <w:tcW w:w="3005" w:type="dxa"/>
+          </w:tcPr>
+          <w:p>
+            <w:r>
+              <w:t>Step 6</w:t>
+            </w:r>
+          </w:p>
+        </w:tc>
+        <w:tc>
+          <w:tcPr>
+            <w:tcW w:w="3005" w:type="dxa"/>
+          </w:tcPr>
+          <w:p>
+            <w:r>
+              <w:t>Take out C</w:t>
+            </w:r>
+          </w:p>
+        </w:tc>
+      </w:tr>
+    </w:tbl>
+    <w:p/>
     <w:p>
       <w:r>
-        <w:rPr>
-          <w:highlight w:val="yellow"/>
-        </w:rPr>
-        <w:t>There is some comparing to do as well need to check the lab sheet</w:t>
+        <w:t xml:space="preserve">Compared to task 2 and 3 the order in which the variables are added and then taken out are different. Swapped over for this example. </w:t>
       </w:r>
     </w:p>
     <w:p>
       <w:r>
         <w:drawing>
-          <wp:anchor distT="0" distB="0" distL="114300" distR="114300" simplePos="0" relativeHeight="251665408" behindDoc="0" locked="0" layoutInCell="1" allowOverlap="1" wp14:anchorId="02AC9A4C" wp14:editId="209EA9B9">
+          <wp:anchor distT="0" distB="0" distL="114300" distR="114300" simplePos="0" relativeHeight="251665408" behindDoc="0" locked="0" layoutInCell="1" allowOverlap="1" wp14:anchorId="02AC9A4C" wp14:editId="24E00771">
             <wp:simplePos x="0" y="0"/>
             <wp:positionH relativeFrom="margin">
-              <wp:align>left</wp:align>
+              <wp:posOffset>-23149</wp:posOffset>
             </wp:positionH>
             <wp:positionV relativeFrom="paragraph">
-              <wp:posOffset>221895</wp:posOffset>
+              <wp:posOffset>213658</wp:posOffset>
             </wp:positionV>
             <wp:extent cx="2082907" cy="368319"/>
             <wp:effectExtent l="0" t="0" r="0" b="0"/>
@@ -195,7 +504,7 @@
                     <pic:cNvPicPr/>
                   </pic:nvPicPr>
                   <pic:blipFill>
-                    <a:blip r:embed="rId7"/>
+                    <a:blip r:embed="rId8"/>
                     <a:stretch>
                       <a:fillRect/>
                     </a:stretch>
@@ -224,17 +533,7 @@
     </w:p>
     <w:p>
       <w:r>
-        <w:rPr>
-          <w:highlight w:val="yellow"/>
-        </w:rPr>
-        <w:t>There might be discussion</w:t>
-      </w:r>
-      <w:r>
-        <w:t xml:space="preserve"> </w:t>
-      </w:r>
-    </w:p>
-    <w:p>
-      <w:r>
+        <w:lastRenderedPageBreak/>
         <w:drawing>
           <wp:anchor distT="0" distB="0" distL="114300" distR="114300" simplePos="0" relativeHeight="251667456" behindDoc="0" locked="0" layoutInCell="1" allowOverlap="1" wp14:anchorId="035F0DB0" wp14:editId="693E72CF">
             <wp:simplePos x="0" y="0"/>
@@ -259,7 +558,7 @@
                     <pic:cNvPicPr/>
                   </pic:nvPicPr>
                   <pic:blipFill>
-                    <a:blip r:embed="rId8"/>
+                    <a:blip r:embed="rId9"/>
                     <a:stretch>
                       <a:fillRect/>
                     </a:stretch>
@@ -283,28 +582,30 @@
         <w:t>Task 5</w:t>
       </w:r>
     </w:p>
+    <w:p>
+      <w:r>
+        <w:t xml:space="preserve">Discuss how weights affect graph operations? </w:t>
+      </w:r>
+    </w:p>
+    <w:p>
+      <w:r>
+        <w:t xml:space="preserve">For DFS and BFS they are </w:t>
+      </w:r>
+      <w:r>
+        <w:t xml:space="preserve">riding on the fact that </w:t>
+      </w:r>
+      <w:r>
+        <w:t xml:space="preserve">they are looking for the shortest route however once you add weights to the graph it alters how it sees the shortest route and decides the route based on </w:t>
+      </w:r>
+      <w:r>
+        <w:t xml:space="preserve">weights. </w:t>
+      </w:r>
+    </w:p>
     <w:p/>
     <w:p>
       <w:r>
-        <w:rPr>
-          <w:highlight w:val="yellow"/>
-        </w:rPr>
-        <w:t>There might be discussion</w:t>
-      </w:r>
-    </w:p>
-    <w:p/>
-    <w:p/>
-    <w:p/>
-    <w:p/>
-    <w:p/>
-    <w:p/>
-    <w:p/>
-    <w:p>
-      <w:r>
         <w:t>Task 6</w:t>
       </w:r>
-    </w:p>
-    <w:p>
       <w:r>
         <w:drawing>
           <wp:anchor distT="0" distB="0" distL="114300" distR="114300" simplePos="0" relativeHeight="251669504" behindDoc="0" locked="0" layoutInCell="1" allowOverlap="1" wp14:anchorId="3C9F7E3E" wp14:editId="6A73FDC4">
@@ -330,7 +631,7 @@
                     <pic:cNvPicPr/>
                   </pic:nvPicPr>
                   <pic:blipFill>
-                    <a:blip r:embed="rId9"/>
+                    <a:blip r:embed="rId10"/>
                     <a:stretch>
                       <a:fillRect/>
                     </a:stretch>
@@ -356,21 +657,15 @@
           </wp:anchor>
         </w:drawing>
       </w:r>
-      <w:r>
-        <w:rPr>
-          <w:highlight w:val="yellow"/>
-        </w:rPr>
-        <w:t>Discuss performance implications of graph size and structure</w:t>
-      </w:r>
-      <w:r>
-        <w:t>.</w:t>
-      </w:r>
     </w:p>
     <w:p/>
+    <w:p/>
+    <w:p/>
     <w:p>
       <w:r>
+        <w:lastRenderedPageBreak/>
         <w:drawing>
-          <wp:anchor distT="0" distB="0" distL="114300" distR="114300" simplePos="0" relativeHeight="251671552" behindDoc="0" locked="0" layoutInCell="1" allowOverlap="1" wp14:anchorId="3FB39305" wp14:editId="57320577">
+          <wp:anchor distT="0" distB="0" distL="114300" distR="114300" simplePos="0" relativeHeight="251671552" behindDoc="0" locked="0" layoutInCell="1" allowOverlap="1" wp14:anchorId="3FB39305" wp14:editId="6A0A99D8">
             <wp:simplePos x="0" y="0"/>
             <wp:positionH relativeFrom="margin">
               <wp:align>center</wp:align>
@@ -393,7 +688,7 @@
                     <pic:cNvPicPr/>
                   </pic:nvPicPr>
                   <pic:blipFill>
-                    <a:blip r:embed="rId10"/>
+                    <a:blip r:embed="rId11"/>
                     <a:stretch>
                       <a:fillRect/>
                     </a:stretch>
@@ -425,31 +720,22 @@
       <w:r>
         <w:br/>
       </w:r>
-      <w:r>
-        <w:rPr>
-          <w:highlight w:val="yellow"/>
-        </w:rPr>
-        <w:t>Discuss performance implications of graph size and structure</w:t>
-      </w:r>
-      <w:r>
-        <w:t>.</w:t>
-      </w:r>
     </w:p>
     <w:p>
       <w:r>
         <w:drawing>
-          <wp:anchor distT="0" distB="0" distL="114300" distR="114300" simplePos="0" relativeHeight="251675648" behindDoc="0" locked="0" layoutInCell="1" allowOverlap="1" wp14:anchorId="4336C561" wp14:editId="031C5B8F">
+          <wp:anchor distT="0" distB="0" distL="114300" distR="114300" simplePos="0" relativeHeight="251675648" behindDoc="0" locked="0" layoutInCell="1" allowOverlap="1" wp14:anchorId="293035C4" wp14:editId="3F6B7603">
             <wp:simplePos x="0" y="0"/>
-            <wp:positionH relativeFrom="margin">
-              <wp:align>left</wp:align>
+            <wp:positionH relativeFrom="column">
+              <wp:posOffset>107950</wp:posOffset>
             </wp:positionH>
             <wp:positionV relativeFrom="paragraph">
-              <wp:posOffset>2974604</wp:posOffset>
+              <wp:posOffset>2724150</wp:posOffset>
             </wp:positionV>
-            <wp:extent cx="2824480" cy="237490"/>
-            <wp:effectExtent l="0" t="0" r="0" b="0"/>
+            <wp:extent cx="2044700" cy="238125"/>
+            <wp:effectExtent l="0" t="0" r="0" b="9525"/>
             <wp:wrapTopAndBottom/>
-            <wp:docPr id="1387647846" name="Picture 1"/>
+            <wp:docPr id="1139747543" name="Picture 1"/>
             <wp:cNvGraphicFramePr>
               <a:graphicFrameLocks xmlns:a="http://schemas.openxmlformats.org/drawingml/2006/main" noChangeAspect="1"/>
             </wp:cNvGraphicFramePr>
@@ -457,11 +743,11 @@
               <a:graphicData uri="http://schemas.openxmlformats.org/drawingml/2006/picture">
                 <pic:pic xmlns:pic="http://schemas.openxmlformats.org/drawingml/2006/picture">
                   <pic:nvPicPr>
-                    <pic:cNvPr id="1387647846" name=""/>
+                    <pic:cNvPr id="1139747543" name=""/>
                     <pic:cNvPicPr/>
                   </pic:nvPicPr>
                   <pic:blipFill>
-                    <a:blip r:embed="rId11"/>
+                    <a:blip r:embed="rId12"/>
                     <a:stretch>
                       <a:fillRect/>
                     </a:stretch>
@@ -469,7 +755,7 @@
                   <pic:spPr>
                     <a:xfrm>
                       <a:off x="0" y="0"/>
-                      <a:ext cx="2824480" cy="237490"/>
+                      <a:ext cx="2044700" cy="238125"/>
                     </a:xfrm>
                     <a:prstGeom prst="rect">
                       <a:avLst/>
@@ -489,18 +775,18 @@
       </w:r>
       <w:r>
         <w:drawing>
-          <wp:anchor distT="0" distB="0" distL="114300" distR="114300" simplePos="0" relativeHeight="251673600" behindDoc="0" locked="0" layoutInCell="1" allowOverlap="1" wp14:anchorId="0923575A" wp14:editId="63790C99">
+          <wp:anchor distT="0" distB="0" distL="114300" distR="114300" simplePos="0" relativeHeight="251673600" behindDoc="0" locked="0" layoutInCell="1" allowOverlap="1" wp14:anchorId="09D5D0E3" wp14:editId="3434FEE3">
             <wp:simplePos x="0" y="0"/>
             <wp:positionH relativeFrom="margin">
               <wp:align>left</wp:align>
             </wp:positionH>
             <wp:positionV relativeFrom="paragraph">
-              <wp:posOffset>2383213</wp:posOffset>
+              <wp:posOffset>2279650</wp:posOffset>
             </wp:positionV>
-            <wp:extent cx="3550285" cy="436245"/>
-            <wp:effectExtent l="0" t="0" r="0" b="1905"/>
+            <wp:extent cx="2863850" cy="402590"/>
+            <wp:effectExtent l="0" t="0" r="0" b="0"/>
             <wp:wrapTopAndBottom/>
-            <wp:docPr id="1828374298" name="Picture 1"/>
+            <wp:docPr id="1814469424" name="Picture 1"/>
             <wp:cNvGraphicFramePr>
               <a:graphicFrameLocks xmlns:a="http://schemas.openxmlformats.org/drawingml/2006/main" noChangeAspect="1"/>
             </wp:cNvGraphicFramePr>
@@ -508,11 +794,11 @@
               <a:graphicData uri="http://schemas.openxmlformats.org/drawingml/2006/picture">
                 <pic:pic xmlns:pic="http://schemas.openxmlformats.org/drawingml/2006/picture">
                   <pic:nvPicPr>
-                    <pic:cNvPr id="1828374298" name=""/>
+                    <pic:cNvPr id="1814469424" name=""/>
                     <pic:cNvPicPr/>
                   </pic:nvPicPr>
                   <pic:blipFill>
-                    <a:blip r:embed="rId12"/>
+                    <a:blip r:embed="rId13"/>
                     <a:stretch>
                       <a:fillRect/>
                     </a:stretch>
@@ -520,7 +806,7 @@
                   <pic:spPr>
                     <a:xfrm>
                       <a:off x="0" y="0"/>
-                      <a:ext cx="3615543" cy="444434"/>
+                      <a:ext cx="2863850" cy="402590"/>
                     </a:xfrm>
                     <a:prstGeom prst="rect">
                       <a:avLst/>
@@ -542,11 +828,286 @@
     <w:p/>
     <w:p>
       <w:r>
-        <w:lastRenderedPageBreak/>
-        <w:t>Task 8</w:t>
+        <w:t>Discuss performance implications of graph size and structure.</w:t>
+      </w:r>
+    </w:p>
+    <w:p>
+      <w:pPr>
+        <w:pStyle w:val="ListParagraph"/>
+        <w:numPr>
+          <w:ilvl w:val="0"/>
+          <w:numId w:val="1"/>
+        </w:numPr>
+      </w:pPr>
+      <w:r>
+        <w:t>The benchmark results demonstrate the performance characteristics of graph operations. The insertion of 1000 vertices completed almost instantly, indicating that vertex addition operates in constant time per operation. Similarly, the insertion of approximately 3000 edges took only a small amount of time, showing efficient edge addition.</w:t>
+      </w:r>
+    </w:p>
+    <w:p>
+      <w:pPr>
+        <w:pStyle w:val="ListParagraph"/>
+        <w:numPr>
+          <w:ilvl w:val="0"/>
+          <w:numId w:val="1"/>
+        </w:numPr>
+      </w:pPr>
+      <w:r>
+        <w:t>To search using BFS took a longer time of 0.0847 seconds</w:t>
+      </w:r>
+      <w:r>
+        <w:t xml:space="preserve"> as this searching method has complexity </w:t>
+      </w:r>
+      <w:r>
+        <w:t xml:space="preserve">as it needs to traversal of all the vertices and edges in the graph </w:t>
       </w:r>
     </w:p>
     <w:p/>
+    <w:p>
+      <w:r>
+        <w:t>Task 8</w:t>
+      </w:r>
+    </w:p>
+    <w:p>
+      <w:r>
+        <w:drawing>
+          <wp:anchor distT="0" distB="0" distL="114300" distR="114300" simplePos="0" relativeHeight="251677696" behindDoc="0" locked="0" layoutInCell="1" allowOverlap="1" wp14:anchorId="5A7F5866" wp14:editId="03F48CF4">
+            <wp:simplePos x="0" y="0"/>
+            <wp:positionH relativeFrom="column">
+              <wp:posOffset>84455</wp:posOffset>
+            </wp:positionH>
+            <wp:positionV relativeFrom="paragraph">
+              <wp:posOffset>382905</wp:posOffset>
+            </wp:positionV>
+            <wp:extent cx="2168525" cy="2503170"/>
+            <wp:effectExtent l="0" t="0" r="3175" b="0"/>
+            <wp:wrapTopAndBottom/>
+            <wp:docPr id="602231267" name="Picture 1"/>
+            <wp:cNvGraphicFramePr>
+              <a:graphicFrameLocks xmlns:a="http://schemas.openxmlformats.org/drawingml/2006/main" noChangeAspect="1"/>
+            </wp:cNvGraphicFramePr>
+            <a:graphic xmlns:a="http://schemas.openxmlformats.org/drawingml/2006/main">
+              <a:graphicData uri="http://schemas.openxmlformats.org/drawingml/2006/picture">
+                <pic:pic xmlns:pic="http://schemas.openxmlformats.org/drawingml/2006/picture">
+                  <pic:nvPicPr>
+                    <pic:cNvPr id="602231267" name=""/>
+                    <pic:cNvPicPr/>
+                  </pic:nvPicPr>
+                  <pic:blipFill>
+                    <a:blip r:embed="rId14"/>
+                    <a:stretch>
+                      <a:fillRect/>
+                    </a:stretch>
+                  </pic:blipFill>
+                  <pic:spPr>
+                    <a:xfrm>
+                      <a:off x="0" y="0"/>
+                      <a:ext cx="2168525" cy="2503170"/>
+                    </a:xfrm>
+                    <a:prstGeom prst="rect">
+                      <a:avLst/>
+                    </a:prstGeom>
+                  </pic:spPr>
+                </pic:pic>
+              </a:graphicData>
+            </a:graphic>
+            <wp14:sizeRelH relativeFrom="margin">
+              <wp14:pctWidth>0</wp14:pctWidth>
+            </wp14:sizeRelH>
+            <wp14:sizeRelV relativeFrom="margin">
+              <wp14:pctHeight>0</wp14:pctHeight>
+            </wp14:sizeRelV>
+          </wp:anchor>
+        </w:drawing>
+      </w:r>
+      <w:r>
+        <w:t xml:space="preserve">This is running the BFS button </w:t>
+      </w:r>
+      <w:r>
+        <w:t xml:space="preserve">when making the directions as false </w:t>
+      </w:r>
+    </w:p>
+    <w:p>
+      <w:r>
+        <w:lastRenderedPageBreak/>
+        <w:drawing>
+          <wp:anchor distT="0" distB="0" distL="114300" distR="114300" simplePos="0" relativeHeight="251681792" behindDoc="0" locked="0" layoutInCell="1" allowOverlap="1" wp14:anchorId="031650F3" wp14:editId="3DD942F8">
+            <wp:simplePos x="0" y="0"/>
+            <wp:positionH relativeFrom="margin">
+              <wp:align>left</wp:align>
+            </wp:positionH>
+            <wp:positionV relativeFrom="paragraph">
+              <wp:posOffset>339902</wp:posOffset>
+            </wp:positionV>
+            <wp:extent cx="3184525" cy="3970655"/>
+            <wp:effectExtent l="0" t="0" r="0" b="0"/>
+            <wp:wrapTopAndBottom/>
+            <wp:docPr id="491696619" name="Picture 1"/>
+            <wp:cNvGraphicFramePr>
+              <a:graphicFrameLocks xmlns:a="http://schemas.openxmlformats.org/drawingml/2006/main" noChangeAspect="1"/>
+            </wp:cNvGraphicFramePr>
+            <a:graphic xmlns:a="http://schemas.openxmlformats.org/drawingml/2006/main">
+              <a:graphicData uri="http://schemas.openxmlformats.org/drawingml/2006/picture">
+                <pic:pic xmlns:pic="http://schemas.openxmlformats.org/drawingml/2006/picture">
+                  <pic:nvPicPr>
+                    <pic:cNvPr id="491696619" name=""/>
+                    <pic:cNvPicPr/>
+                  </pic:nvPicPr>
+                  <pic:blipFill>
+                    <a:blip r:embed="rId15"/>
+                    <a:stretch>
+                      <a:fillRect/>
+                    </a:stretch>
+                  </pic:blipFill>
+                  <pic:spPr>
+                    <a:xfrm>
+                      <a:off x="0" y="0"/>
+                      <a:ext cx="3184525" cy="3970655"/>
+                    </a:xfrm>
+                    <a:prstGeom prst="rect">
+                      <a:avLst/>
+                    </a:prstGeom>
+                  </pic:spPr>
+                </pic:pic>
+              </a:graphicData>
+            </a:graphic>
+            <wp14:sizeRelH relativeFrom="margin">
+              <wp14:pctWidth>0</wp14:pctWidth>
+            </wp14:sizeRelH>
+            <wp14:sizeRelV relativeFrom="margin">
+              <wp14:pctHeight>0</wp14:pctHeight>
+            </wp14:sizeRelV>
+          </wp:anchor>
+        </w:drawing>
+      </w:r>
+      <w:r>
+        <w:t xml:space="preserve">This is running the DFS button </w:t>
+      </w:r>
+      <w:r>
+        <w:t xml:space="preserve">when running the direction as true </w:t>
+      </w:r>
+    </w:p>
+    <w:p/>
+    <w:p/>
+    <w:p>
+      <w:r>
+        <w:lastRenderedPageBreak/>
+        <w:drawing>
+          <wp:anchor distT="0" distB="0" distL="114300" distR="114300" simplePos="0" relativeHeight="251679744" behindDoc="0" locked="0" layoutInCell="1" allowOverlap="1" wp14:anchorId="572247D9" wp14:editId="07DBBD1A">
+            <wp:simplePos x="0" y="0"/>
+            <wp:positionH relativeFrom="margin">
+              <wp:align>left</wp:align>
+            </wp:positionH>
+            <wp:positionV relativeFrom="paragraph">
+              <wp:posOffset>472440</wp:posOffset>
+            </wp:positionV>
+            <wp:extent cx="2912745" cy="3580765"/>
+            <wp:effectExtent l="0" t="0" r="1905" b="635"/>
+            <wp:wrapTopAndBottom/>
+            <wp:docPr id="76983278" name="Picture 1"/>
+            <wp:cNvGraphicFramePr>
+              <a:graphicFrameLocks xmlns:a="http://schemas.openxmlformats.org/drawingml/2006/main" noChangeAspect="1"/>
+            </wp:cNvGraphicFramePr>
+            <a:graphic xmlns:a="http://schemas.openxmlformats.org/drawingml/2006/main">
+              <a:graphicData uri="http://schemas.openxmlformats.org/drawingml/2006/picture">
+                <pic:pic xmlns:pic="http://schemas.openxmlformats.org/drawingml/2006/picture">
+                  <pic:nvPicPr>
+                    <pic:cNvPr id="76983278" name=""/>
+                    <pic:cNvPicPr/>
+                  </pic:nvPicPr>
+                  <pic:blipFill>
+                    <a:blip r:embed="rId16"/>
+                    <a:stretch>
+                      <a:fillRect/>
+                    </a:stretch>
+                  </pic:blipFill>
+                  <pic:spPr>
+                    <a:xfrm>
+                      <a:off x="0" y="0"/>
+                      <a:ext cx="2912745" cy="3580765"/>
+                    </a:xfrm>
+                    <a:prstGeom prst="rect">
+                      <a:avLst/>
+                    </a:prstGeom>
+                  </pic:spPr>
+                </pic:pic>
+              </a:graphicData>
+            </a:graphic>
+            <wp14:sizeRelH relativeFrom="margin">
+              <wp14:pctWidth>0</wp14:pctWidth>
+            </wp14:sizeRelH>
+            <wp14:sizeRelV relativeFrom="margin">
+              <wp14:pctHeight>0</wp14:pctHeight>
+            </wp14:sizeRelV>
+          </wp:anchor>
+        </w:drawing>
+      </w:r>
+      <w:r>
+        <w:t xml:space="preserve">This is running the Detect Undirected Cycle, but I will need to change the direction of the code from true to false for this button to work. </w:t>
+      </w:r>
+      <w:r>
+        <w:br/>
+      </w:r>
+    </w:p>
+    <w:p>
+      <w:r>
+        <w:lastRenderedPageBreak/>
+        <w:drawing>
+          <wp:anchor distT="0" distB="0" distL="114300" distR="114300" simplePos="0" relativeHeight="251683840" behindDoc="0" locked="0" layoutInCell="1" allowOverlap="1" wp14:anchorId="3BB69606" wp14:editId="32FE650F">
+            <wp:simplePos x="0" y="0"/>
+            <wp:positionH relativeFrom="margin">
+              <wp:align>left</wp:align>
+            </wp:positionH>
+            <wp:positionV relativeFrom="paragraph">
+              <wp:posOffset>391116</wp:posOffset>
+            </wp:positionV>
+            <wp:extent cx="3727450" cy="4340860"/>
+            <wp:effectExtent l="0" t="0" r="6350" b="2540"/>
+            <wp:wrapTopAndBottom/>
+            <wp:docPr id="719617614" name="Picture 1"/>
+            <wp:cNvGraphicFramePr>
+              <a:graphicFrameLocks xmlns:a="http://schemas.openxmlformats.org/drawingml/2006/main" noChangeAspect="1"/>
+            </wp:cNvGraphicFramePr>
+            <a:graphic xmlns:a="http://schemas.openxmlformats.org/drawingml/2006/main">
+              <a:graphicData uri="http://schemas.openxmlformats.org/drawingml/2006/picture">
+                <pic:pic xmlns:pic="http://schemas.openxmlformats.org/drawingml/2006/picture">
+                  <pic:nvPicPr>
+                    <pic:cNvPr id="719617614" name=""/>
+                    <pic:cNvPicPr/>
+                  </pic:nvPicPr>
+                  <pic:blipFill>
+                    <a:blip r:embed="rId17"/>
+                    <a:stretch>
+                      <a:fillRect/>
+                    </a:stretch>
+                  </pic:blipFill>
+                  <pic:spPr>
+                    <a:xfrm>
+                      <a:off x="0" y="0"/>
+                      <a:ext cx="3727450" cy="4340860"/>
+                    </a:xfrm>
+                    <a:prstGeom prst="rect">
+                      <a:avLst/>
+                    </a:prstGeom>
+                  </pic:spPr>
+                </pic:pic>
+              </a:graphicData>
+            </a:graphic>
+            <wp14:sizeRelH relativeFrom="margin">
+              <wp14:pctWidth>0</wp14:pctWidth>
+            </wp14:sizeRelH>
+            <wp14:sizeRelV relativeFrom="margin">
+              <wp14:pctHeight>0</wp14:pctHeight>
+            </wp14:sizeRelV>
+          </wp:anchor>
+        </w:drawing>
+      </w:r>
+      <w:r>
+        <w:t xml:space="preserve">This is running the Detect Directed Cycle but the direction has to be set to true. </w:t>
+      </w:r>
+      <w:r>
+        <w:br/>
+      </w:r>
+    </w:p>
     <w:sectPr>
       <w:pgSz w:w="11906" w:h="16838"/>
       <w:pgMar w:top="1440" w:right="1440" w:bottom="1440" w:left="1440" w:header="708" w:footer="708" w:gutter="0"/>
@@ -555,6 +1116,127 @@
     </w:sectPr>
   </w:body>
 </w:document>
+</file>
+
+<file path=word/numbering.xml><?xml version="1.0" encoding="utf-8"?>
+<w:numbering xmlns:wpc="http://schemas.microsoft.com/office/word/2010/wordprocessingCanvas" xmlns:cx="http://schemas.microsoft.com/office/drawing/2014/chartex" xmlns:cx1="http://schemas.microsoft.com/office/drawing/2015/9/8/chartex" xmlns:cx2="http://schemas.microsoft.com/office/drawing/2015/10/21/chartex" xmlns:cx3="http://schemas.microsoft.com/office/drawing/2016/5/9/chartex" xmlns:cx4="http://schemas.microsoft.com/office/drawing/2016/5/10/chartex" xmlns:cx5="http://schemas.microsoft.com/office/drawing/2016/5/11/chartex" xmlns:cx6="http://schemas.microsoft.com/office/drawing/2016/5/12/chartex" xmlns:cx7="http://schemas.microsoft.com/office/drawing/2016/5/13/chartex" xmlns:cx8="http://schemas.microsoft.com/office/drawing/2016/5/14/chartex" xmlns:mc="http://schemas.openxmlformats.org/markup-compatibility/2006" xmlns:aink="http://schemas.microsoft.com/office/drawing/2016/ink" xmlns:am3d="http://schemas.microsoft.com/office/drawing/2017/model3d" xmlns:o="urn:schemas-microsoft-com:office:office" xmlns:oel="http://schemas.microsoft.com/office/2019/extlst" xmlns:r="http://schemas.openxmlformats.org/officeDocument/2006/relationships" xmlns:m="http://schemas.openxmlformats.org/officeDocument/2006/math" xmlns:v="urn:schemas-microsoft-com:vml" xmlns:wp14="http://schemas.microsoft.com/office/word/2010/wordprocessingDrawing" xmlns:wp="http://schemas.openxmlformats.org/drawingml/2006/wordprocessingDrawing" xmlns:w10="urn:schemas-microsoft-com:office:word" xmlns:w="http://schemas.openxmlformats.org/wordprocessingml/2006/main" xmlns:w14="http://schemas.microsoft.com/office/word/2010/wordml" xmlns:w15="http://schemas.microsoft.com/office/word/2012/wordml" xmlns:w16cex="http://schemas.microsoft.com/office/word/2018/wordml/cex" xmlns:w16cid="http://schemas.microsoft.com/office/word/2016/wordml/cid" xmlns:w16="http://schemas.microsoft.com/office/word/2018/wordml" xmlns:w16du="http://schemas.microsoft.com/office/word/2023/wordml/word16du" xmlns:w16sdtdh="http://schemas.microsoft.com/office/word/2020/wordml/sdtdatahash" xmlns:w16sdtfl="http://schemas.microsoft.com/office/word/2024/wordml/sdtformatlock" xmlns:w16se="http://schemas.microsoft.com/office/word/2015/wordml/symex" xmlns:wpg="http://schemas.microsoft.com/office/word/2010/wordprocessingGroup" xmlns:wpi="http://schemas.microsoft.com/office/word/2010/wordprocessingInk" xmlns:wne="http://schemas.microsoft.com/office/word/2006/wordml" xmlns:wps="http://schemas.microsoft.com/office/word/2010/wordprocessingShape" mc:Ignorable="w14 w15 w16se w16cid w16 w16cex w16sdtdh w16sdtfl w16du wp14">
+  <w:abstractNum w:abstractNumId="0" w15:restartNumberingAfterBreak="0">
+    <w:nsid w:val="717848F8"/>
+    <w:multiLevelType w:val="hybridMultilevel"/>
+    <w:tmpl w:val="8FFA00F0"/>
+    <w:lvl w:ilvl="0" w:tplc="F6220E22">
+      <w:start w:val="7"/>
+      <w:numFmt w:val="bullet"/>
+      <w:lvlText w:val="-"/>
+      <w:lvlJc w:val="left"/>
+      <w:pPr>
+        <w:ind w:left="720" w:hanging="360"/>
+      </w:pPr>
+      <w:rPr>
+        <w:rFonts w:ascii="Aptos" w:eastAsiaTheme="minorHAnsi" w:hAnsi="Aptos" w:cstheme="minorBidi" w:hint="default"/>
+      </w:rPr>
+    </w:lvl>
+    <w:lvl w:ilvl="1" w:tplc="0C090003" w:tentative="1">
+      <w:start w:val="1"/>
+      <w:numFmt w:val="bullet"/>
+      <w:lvlText w:val="o"/>
+      <w:lvlJc w:val="left"/>
+      <w:pPr>
+        <w:ind w:left="1440" w:hanging="360"/>
+      </w:pPr>
+      <w:rPr>
+        <w:rFonts w:ascii="Courier New" w:hAnsi="Courier New" w:cs="Courier New" w:hint="default"/>
+      </w:rPr>
+    </w:lvl>
+    <w:lvl w:ilvl="2" w:tplc="0C090005" w:tentative="1">
+      <w:start w:val="1"/>
+      <w:numFmt w:val="bullet"/>
+      <w:lvlText w:val=""/>
+      <w:lvlJc w:val="left"/>
+      <w:pPr>
+        <w:ind w:left="2160" w:hanging="360"/>
+      </w:pPr>
+      <w:rPr>
+        <w:rFonts w:ascii="Wingdings" w:hAnsi="Wingdings" w:hint="default"/>
+      </w:rPr>
+    </w:lvl>
+    <w:lvl w:ilvl="3" w:tplc="0C090001" w:tentative="1">
+      <w:start w:val="1"/>
+      <w:numFmt w:val="bullet"/>
+      <w:lvlText w:val=""/>
+      <w:lvlJc w:val="left"/>
+      <w:pPr>
+        <w:ind w:left="2880" w:hanging="360"/>
+      </w:pPr>
+      <w:rPr>
+        <w:rFonts w:ascii="Symbol" w:hAnsi="Symbol" w:hint="default"/>
+      </w:rPr>
+    </w:lvl>
+    <w:lvl w:ilvl="4" w:tplc="0C090003" w:tentative="1">
+      <w:start w:val="1"/>
+      <w:numFmt w:val="bullet"/>
+      <w:lvlText w:val="o"/>
+      <w:lvlJc w:val="left"/>
+      <w:pPr>
+        <w:ind w:left="3600" w:hanging="360"/>
+      </w:pPr>
+      <w:rPr>
+        <w:rFonts w:ascii="Courier New" w:hAnsi="Courier New" w:cs="Courier New" w:hint="default"/>
+      </w:rPr>
+    </w:lvl>
+    <w:lvl w:ilvl="5" w:tplc="0C090005" w:tentative="1">
+      <w:start w:val="1"/>
+      <w:numFmt w:val="bullet"/>
+      <w:lvlText w:val=""/>
+      <w:lvlJc w:val="left"/>
+      <w:pPr>
+        <w:ind w:left="4320" w:hanging="360"/>
+      </w:pPr>
+      <w:rPr>
+        <w:rFonts w:ascii="Wingdings" w:hAnsi="Wingdings" w:hint="default"/>
+      </w:rPr>
+    </w:lvl>
+    <w:lvl w:ilvl="6" w:tplc="0C090001" w:tentative="1">
+      <w:start w:val="1"/>
+      <w:numFmt w:val="bullet"/>
+      <w:lvlText w:val=""/>
+      <w:lvlJc w:val="left"/>
+      <w:pPr>
+        <w:ind w:left="5040" w:hanging="360"/>
+      </w:pPr>
+      <w:rPr>
+        <w:rFonts w:ascii="Symbol" w:hAnsi="Symbol" w:hint="default"/>
+      </w:rPr>
+    </w:lvl>
+    <w:lvl w:ilvl="7" w:tplc="0C090003" w:tentative="1">
+      <w:start w:val="1"/>
+      <w:numFmt w:val="bullet"/>
+      <w:lvlText w:val="o"/>
+      <w:lvlJc w:val="left"/>
+      <w:pPr>
+        <w:ind w:left="5760" w:hanging="360"/>
+      </w:pPr>
+      <w:rPr>
+        <w:rFonts w:ascii="Courier New" w:hAnsi="Courier New" w:cs="Courier New" w:hint="default"/>
+      </w:rPr>
+    </w:lvl>
+    <w:lvl w:ilvl="8" w:tplc="0C090005" w:tentative="1">
+      <w:start w:val="1"/>
+      <w:numFmt w:val="bullet"/>
+      <w:lvlText w:val=""/>
+      <w:lvlJc w:val="left"/>
+      <w:pPr>
+        <w:ind w:left="6480" w:hanging="360"/>
+      </w:pPr>
+      <w:rPr>
+        <w:rFonts w:ascii="Wingdings" w:hAnsi="Wingdings" w:hint="default"/>
+      </w:rPr>
+    </w:lvl>
+  </w:abstractNum>
+  <w:num w:numId="1" w16cid:durableId="1299650233">
+    <w:abstractNumId w:val="0"/>
+  </w:num>
+</w:numbering>
 </file>
 
 <file path=word/styles.xml><?xml version="1.0" encoding="utf-8"?>
@@ -1160,7 +1842,6 @@
   <w:style w:type="character" w:default="1" w:styleId="DefaultParagraphFont">
     <w:name w:val="Default Paragraph Font"/>
     <w:uiPriority w:val="1"/>
-    <w:semiHidden/>
     <w:unhideWhenUsed/>
   </w:style>
   <w:style w:type="table" w:default="1" w:styleId="TableNormal">
@@ -1493,6 +2174,25 @@
       <w:color w:val="0F4761" w:themeColor="accent1" w:themeShade="BF"/>
       <w:spacing w:val="5"/>
     </w:rPr>
+  </w:style>
+  <w:style w:type="table" w:styleId="TableGrid">
+    <w:name w:val="Table Grid"/>
+    <w:basedOn w:val="TableNormal"/>
+    <w:uiPriority w:val="39"/>
+    <w:rsid w:val="001D0E26"/>
+    <w:pPr>
+      <w:spacing w:after="0" w:line="240" w:lineRule="auto"/>
+    </w:pPr>
+    <w:tblPr>
+      <w:tblBorders>
+        <w:top w:val="single" w:sz="4" w:space="0" w:color="auto"/>
+        <w:left w:val="single" w:sz="4" w:space="0" w:color="auto"/>
+        <w:bottom w:val="single" w:sz="4" w:space="0" w:color="auto"/>
+        <w:right w:val="single" w:sz="4" w:space="0" w:color="auto"/>
+        <w:insideH w:val="single" w:sz="4" w:space="0" w:color="auto"/>
+        <w:insideV w:val="single" w:sz="4" w:space="0" w:color="auto"/>
+      </w:tblBorders>
+    </w:tblPr>
   </w:style>
 </w:styles>
 </file>

</xml_diff>